<commit_message>
chore: remove platform auth controls
</commit_message>
<xml_diff>
--- a/docs/一种科学仿真语言路由器自动训练方法、系统、设备及存储介质（专利化附图版）.docx
+++ b/docs/一种科学仿真语言路由器自动训练方法、系统、设备及存储介质（专利化附图版）.docx
@@ -31,7 +31,7 @@
           <w:sz w:val="28"/>
           <w:szCs w:val="28"/>
         </w:rPr>
-        <w:t xml:space="preserve">本发明公开了一种科学仿真语言路由器自动训练方法、系统、设备及存储介质。该方法发现并聚合路由训练数据，获取图形处理器状态并在任务创建时执行锁定校验；根据仿真器、场景、测试比例、输入表示、嵌入模型和分词器生成确定性预处理缓存；启动独立训练子进程并持久化配置、日志、停止令牌和运行目录；训练期间结合进程、日志、指标、检查点和停止文件推断状态；按照保留数量管理最近轮次权重并在恢复前校验兼容性。该方案提高远程训练的复现性、可恢复性和资源安全性。</w:t>
+        <w:t xml:space="preserve">本发明公开了一种科学仿真语言路由器自动训练方法、系统、设备及存储介质。该方法发现并聚合路由训练数据，获取图形处理器状态并在任务创建时执行锁定校验；根据仿真器、场景、测试比例、输入表示、嵌入模型和分词器生成确定性预处理缓存；启动独立训练子进程并持久化配置、日志、停止控制文件和运行目录；训练期间结合进程、日志、指标、检查点和停止文件推断状态；按照保留数量管理最近轮次权重并在恢复前校验兼容性。该方案提高远程训练的复现性、可恢复性和资源安全性。</w:t>
       </w:r>
     </w:p>
     <w:p>
@@ -203,7 +203,7 @@
           <w:sz w:val="28"/>
           <w:szCs w:val="28"/>
         </w:rPr>
-        <w:t xml:space="preserve">S5，创建训练任务并启动独立训练子进程，所述训练子进程被设置有图形处理器环境变量、运行目录、日志路径、停止令牌和停止控制文件；</w:t>
+        <w:t xml:space="preserve">S5，创建训练任务并启动独立训练子进程，所述训练子进程被设置有图形处理器环境变量、运行目录、日志路径和停止控制文件；</w:t>
       </w:r>
     </w:p>
     <w:p>
@@ -343,7 +343,7 @@
           <w:sz w:val="28"/>
           <w:szCs w:val="28"/>
         </w:rPr>
-        <w:t xml:space="preserve">9．根据权利要求 1 所述的方法，其特征在于，所述停止控制文件包含停止令牌；当平台接收到停止请求时，向所述停止控制文件写入与训练子进程环境变量匹配的停止令牌，并向训练子进程发送终止信号；所述训练子进程仅在停止令牌校验通过后执行安全停止处理。</w:t>
+        <w:t xml:space="preserve">9．根据权利要求 1 所述的方法，其特征在于，所述停止控制文件包含任务标识、请求时间和停止原因；当平台接收到停止请求时，向所述停止控制文件写入停止请求并向训练子进程发送终止信号；所述训练子进程在读取到有效停止请求后于安全点保存检查点并退出。</w:t>
       </w:r>
     </w:p>
     <w:p>
@@ -759,7 +759,7 @@
           <w:sz w:val="28"/>
           <w:szCs w:val="28"/>
         </w:rPr>
-        <w:t xml:space="preserve">在训练任务启动阶段，平台为任务生成任务标识和运行目录，构造训练命令，设置图形处理器环境变量，使训练子进程仅能看到指定图形处理器。平台还为训练任务生成停止令牌和停止控制文件路径，并将任务配置、命令、运行目录、日志路径、进程标识和停止控制信息持久化保存。训练脚本启动后写入训练日志、训练指标、测试指标、分场景指标和检查点文件。</w:t>
+        <w:t xml:space="preserve">在训练任务启动阶段，平台为任务生成任务标识和运行目录，构造训练命令，设置图形处理器环境变量，使训练子进程仅能看到指定图形处理器。平台还为训练任务生成停止控制文件路径，并将任务配置、命令、运行目录、日志路径、进程标识和停止控制信息持久化保存。训练脚本启动后写入训练日志、训练指标、测试指标、分场景指标和检查点文件。</w:t>
       </w:r>
     </w:p>
     <w:p>
@@ -801,7 +801,7 @@
           <w:sz w:val="28"/>
           <w:szCs w:val="28"/>
         </w:rPr>
-        <w:t xml:space="preserve">在安全停止方面，平台接收到停止请求后，向停止控制文件写入停止令牌，并向训练子进程发送终止信号。训练子进程收到信号后读取停止控制文件，只有当停止令牌与环境变量中的令牌一致时，才执行平台授权的停止流程，包括在安全点保存检查点、写入停止状态并退出。若训练子进程未在预设时间内退出，平台可以执行后续强制终止策略。</w:t>
+        <w:t xml:space="preserve">在安全停止方面，平台接收到停止请求后，向停止控制文件写入任务标识、请求时间和停止原因，并向训练子进程发送终止信号。训练子进程收到信号后读取停止控制文件，在识别到平台停止请求后执行停止流程，包括在安全点保存检查点、写入停止状态并退出。若训练子进程未在预设时间内退出，平台可以执行后续强制终止策略。</w:t>
       </w:r>
     </w:p>
     <w:p>
@@ -1011,7 +1011,7 @@
           <w:sz w:val="28"/>
           <w:szCs w:val="28"/>
         </w:rPr>
-        <w:t xml:space="preserve">5. 通过令牌化停止控制文件，在训练安全点保存权重并减少非授权信号造成的误停止。</w:t>
+        <w:t xml:space="preserve">5. 通过停止控制文件协同训练子进程，在训练安全点保存权重并减少直接终止造成的权重损坏。</w:t>
       </w:r>
     </w:p>
     <w:p>
@@ -1305,7 +1305,7 @@
           <w:sz w:val="28"/>
           <w:szCs w:val="28"/>
         </w:rPr>
-        <w:t xml:space="preserve">平台为每个训练任务生成任务标识，例如由时间戳或随机标识构成。平台创建运行目录和日志文件，构造训练命令，并设置环境变量。环境变量至少包括指定图形处理器可见性的变量和平台停止令牌。平台以独立子进程方式启动训练脚本，并记录子进程标识、命令、训练配置、运行目录、日志路径和停止控制文件路径。</w:t>
+        <w:t xml:space="preserve">平台为每个训练任务生成任务标识，例如由时间戳或随机标识构成。平台创建运行目录和日志文件，构造训练命令，并设置环境变量。环境变量至少包括指定图形处理器可见性的变量。平台以独立子进程方式启动训练脚本，并记录子进程标识、命令、训练配置、运行目录、日志路径和停止控制文件路径。</w:t>
       </w:r>
     </w:p>
     <w:p>
@@ -1445,7 +1445,7 @@
           <w:sz w:val="28"/>
           <w:szCs w:val="28"/>
         </w:rPr>
-        <w:t xml:space="preserve">当用户请求停止训练时，平台将停止令牌写入停止控制文件，并向训练子进程发送终止信号。训练子进程捕获信号后读取停止控制文件，若文件中的停止令牌与环境变量中的令牌一致，则将停止请求标记为有效，并在当前安全点保存检查点、写入停止状态文件后退出。若停止令牌不一致，则忽略该信号或按非授权信号处理。</w:t>
+        <w:t xml:space="preserve">当用户请求停止训练时，平台将任务标识、请求时间和停止原因写入停止控制文件，并向训练子进程发送终止信号。训练子进程捕获信号后读取停止控制文件，若识别到平台停止请求，则将停止请求标记为有效，并在当前安全点保存检查点、写入停止状态文件后退出。</w:t>
       </w:r>
     </w:p>
     <w:p>

</xml_diff>